<commit_message>
docs: update DATN documents with survey design and reference list
</commit_message>
<xml_diff>
--- a/BAOCAO/DE_CUONG_DATN_TranLamNghia.docx
+++ b/BAOCAO/DE_CUONG_DATN_TranLamNghia.docx
@@ -136,7 +136,7 @@
                 </mc:Choice>
                 <mc:Fallback>
                   <w:pict>
-                    <v:shapetype w14:anchorId="2EF8154E" id="_x0000_t32" coordsize="21600,21600" o:spt="32" o:oned="t" path="m,l21600,21600e" filled="f">
+                    <v:shapetype w14:anchorId="1FC45A18" id="_x0000_t32" coordsize="21600,21600" o:spt="32" o:oned="t" path="m,l21600,21600e" filled="f">
                       <v:path arrowok="t" fillok="f" o:connecttype="none"/>
                       <o:lock v:ext="edit" shapetype="t"/>
                     </v:shapetype>
@@ -287,7 +287,7 @@
                 </mc:Choice>
                 <mc:Fallback>
                   <w:pict>
-                    <v:shape w14:anchorId="135DB969" id="AutoShape 4" o:spid="_x0000_s1026" type="#_x0000_t32" style="position:absolute;margin-left:60.35pt;margin-top:15.9pt;width:155.9pt;height:0;z-index:251657216;visibility:visible;mso-wrap-style:square;mso-width-percent:0;mso-height-percent:0;mso-wrap-distance-left:9pt;mso-wrap-distance-top:0;mso-wrap-distance-right:9pt;mso-wrap-distance-bottom:0;mso-position-horizontal:absolute;mso-position-horizontal-relative:text;mso-position-vertical:absolute;mso-position-vertical-relative:text;mso-width-percent:0;mso-height-percent:0;mso-width-relative:page;mso-height-relative:page" o:gfxdata="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"/>
+                    <v:shape w14:anchorId="6D996260" id="AutoShape 4" o:spid="_x0000_s1026" type="#_x0000_t32" style="position:absolute;margin-left:60.35pt;margin-top:15.9pt;width:155.9pt;height:0;z-index:251657216;visibility:visible;mso-wrap-style:square;mso-width-percent:0;mso-height-percent:0;mso-wrap-distance-left:9pt;mso-wrap-distance-top:0;mso-wrap-distance-right:9pt;mso-wrap-distance-bottom:0;mso-position-horizontal:absolute;mso-position-horizontal-relative:text;mso-position-vertical:absolute;mso-position-vertical-relative:text;mso-width-percent:0;mso-height-percent:0;mso-width-relative:page;mso-height-relative:page" o:gfxdata="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"/>
                   </w:pict>
                 </mc:Fallback>
               </mc:AlternateContent>
@@ -1664,7 +1664,45 @@
           <w:szCs w:val="26"/>
         </w:rPr>
         <w:lastRenderedPageBreak/>
-        <w:t>Thiết kế cơ chế giải quyết bài toán khởi đầu nguội: hệ thống vận hành theo ba giai đoạn tương ứng với độ trưởng thành dữ liệu của từng người dùng — giai đoạn thứ nhất chỉ có hồ sơ sức khỏe nên chấm điểm theo quy tắc dinh dưỡng và mức độ phổ biến chung của món ăn; giai đoạn thứ hai bắt đầu ngay sau khi người dùng hoàn tất phiên tương tác thăm dò, trong đó người dùng đánh giá nhanh từng món bằng thao tác vuốt theo bốn mức thích, không thích, bình thường và chưa biết, trên một tập món được chọn theo nguyên tắc cực đại hóa độ đa dạng nhằm thu được lượng thông tin lớn nhất trên mỗi lượt tương tác, từ đó dựng hồ sơ sở thích ban đầu và chấm điểm bằng độ tương đồng cosin; giai đoạn thứ ba chuyển sang mô hình học máy có giám sát khi người dùng đã tích lũy đủ dữ liệu nhật ký ăn uống và đánh giá thực tế; thiết kế cơ chế chuyển tiếp dần giữa hai phương pháp chấm điểm bằng hệ số trộn phụ thuộc số lượng tín hiệu đã thu thập, nhằm tránh thay đổi đột ngột trong trải nghiệm của người dùng;</w:t>
+        <w:t xml:space="preserve">Thiết kế cơ chế giải quyết bài toán </w:t>
+      </w:r>
+      <w:r>
+        <w:rPr>
+          <w:rFonts w:ascii="Times New Roman" w:hAnsi="Times New Roman"/>
+          <w:noProof/>
+          <w:sz w:val="26"/>
+          <w:szCs w:val="26"/>
+          <w:lang w:val="vi-VN"/>
+        </w:rPr>
+        <w:t>Cold-Start</w:t>
+      </w:r>
+      <w:r>
+        <w:rPr>
+          <w:rFonts w:ascii="Times New Roman" w:hAnsi="Times New Roman"/>
+          <w:noProof/>
+          <w:sz w:val="26"/>
+          <w:szCs w:val="26"/>
+        </w:rPr>
+        <w:t xml:space="preserve">: hệ thống vận hành theo ba giai đoạn tương ứng với độ trưởng thành dữ liệu của từng người dùng — giai đoạn thứ nhất chỉ có hồ sơ sức khỏe nên chấm điểm theo quy tắc dinh dưỡng và mức độ phổ biến chung của món ăn; giai đoạn thứ hai bắt đầu ngay sau khi người dùng hoàn tất phiên tương tác thăm dò, trong đó người dùng đánh giá nhanh từng món bằng thao tác vuốt theo bốn mức thích, không thích, bình thường và chưa biết, trên một tập món được chọn theo nguyên tắc cực đại hóa độ đa dạng nhằm thu được lượng thông tin lớn nhất trên mỗi lượt tương tác, từ đó dựng hồ sơ sở thích ban đầu và chấm điểm bằng độ tương đồng cosin; giai đoạn thứ ba chuyển sang mô hình học máy có giám sát khi người dùng đã tích lũy đủ dữ liệu nhật ký ăn uống và đánh giá thực tế; thiết kế cơ chế chuyển tiếp dần giữa hai phương pháp chấm điểm bằng hệ số trộn phụ thuộc số lượng tín hiệu đã thu thập, nhằm tránh thay đổi đột ngột trong trải nghiệm của người dùng; phiên tương tác thăm dò chỉ được thực hiện một lần duy nhất tại bước khởi tạo tài khoản, sau đó hệ thống hoàn toàn học từ hành vi thực tế của người dùng đối với thực đơn được gợi </w:t>
+      </w:r>
+      <w:r>
+        <w:rPr>
+          <w:rFonts w:ascii="Times New Roman" w:hAnsi="Times New Roman"/>
+          <w:noProof/>
+          <w:sz w:val="26"/>
+          <w:szCs w:val="26"/>
+        </w:rPr>
+        <w:t>ý</w:t>
+      </w:r>
+      <w:r>
+        <w:rPr>
+          <w:rFonts w:ascii="Times New Roman" w:hAnsi="Times New Roman"/>
+          <w:noProof/>
+          <w:sz w:val="26"/>
+          <w:szCs w:val="26"/>
+          <w:lang w:val="vi-VN"/>
+        </w:rPr>
+        <w:t>.</w:t>
       </w:r>
     </w:p>
     <w:p>
@@ -1693,31 +1731,26 @@
           <w:sz w:val="26"/>
           <w:szCs w:val="26"/>
         </w:rPr>
-        <w:t>Thiết kế giao diện người dùng: sơ đồ luồng màn hình và bản thiết kế các màn hình chính theo nguyên tắc bảo đảm tính nhất quán và dễ thao tác.</w:t>
-      </w:r>
-    </w:p>
-    <w:p>
-      <w:pPr>
-        <w:tabs>
-          <w:tab w:val="left" w:leader="dot" w:pos="8931"/>
-        </w:tabs>
-        <w:spacing w:before="240" w:after="0" w:line="312" w:lineRule="auto"/>
-        <w:ind w:firstLine="720"/>
-        <w:rPr>
-          <w:rFonts w:ascii="Times New Roman" w:hAnsi="Times New Roman"/>
-          <w:noProof/>
-          <w:sz w:val="26"/>
-          <w:szCs w:val="26"/>
-        </w:rPr>
-      </w:pPr>
-      <w:r>
-        <w:rPr>
-          <w:rFonts w:ascii="Times New Roman" w:hAnsi="Times New Roman"/>
-          <w:noProof/>
-          <w:sz w:val="26"/>
-          <w:szCs w:val="26"/>
-        </w:rPr>
-        <w:t>Chương 3: Xây dựng chương trình</w:t>
+        <w:t xml:space="preserve">Thiết kế cơ chế chống suy giảm đa dạng của thực đơn: chia số suất trong mỗi thực đơn thành nhóm khai thác và nhóm thăm dò, trong đó nhóm khai thác được xếp hạng theo vector sở thích của người dùng, còn nhóm thăm dò được xếp hạng theo chính vector đó sau khi làm nhiễu nhẹ, nhằm gợi ý những món nằm ở vùng lân cận khẩu vị thay vì những món ngẫu </w:t>
+      </w:r>
+      <w:r>
+        <w:rPr>
+          <w:rFonts w:ascii="Times New Roman" w:hAnsi="Times New Roman"/>
+          <w:noProof/>
+          <w:sz w:val="26"/>
+          <w:szCs w:val="26"/>
+        </w:rPr>
+        <w:t>nhiên</w:t>
+      </w:r>
+      <w:r>
+        <w:rPr>
+          <w:rFonts w:ascii="Times New Roman" w:hAnsi="Times New Roman"/>
+          <w:noProof/>
+          <w:sz w:val="26"/>
+          <w:szCs w:val="26"/>
+          <w:lang w:val="vi-VN"/>
+        </w:rPr>
+        <w:t>.</w:t>
       </w:r>
     </w:p>
     <w:p>
@@ -1746,7 +1779,31 @@
           <w:sz w:val="26"/>
           <w:szCs w:val="26"/>
         </w:rPr>
-        <w:t>Xây dựng tập dữ liệu dinh dưỡng: thu thập thông tin món ăn Việt Nam từ Bảng thành phần thực phẩm Việt Nam và các nguồn dữ liệu mở, sau đó chuẩn hóa đơn vị, xử lý dữ liệu khuyết và mã hóa đặc trưng theo phương pháp đã trình bày ở Chương 1;</w:t>
+        <w:t>Thiết kế giao diện người dùng: sơ đồ luồng màn hình và bản thiết kế các màn hình chính theo nguyên tắc bảo đảm tính nhất quán và dễ thao tác.</w:t>
+      </w:r>
+    </w:p>
+    <w:p>
+      <w:pPr>
+        <w:tabs>
+          <w:tab w:val="left" w:leader="dot" w:pos="8931"/>
+        </w:tabs>
+        <w:spacing w:before="240" w:after="0" w:line="312" w:lineRule="auto"/>
+        <w:ind w:firstLine="720"/>
+        <w:rPr>
+          <w:rFonts w:ascii="Times New Roman" w:hAnsi="Times New Roman"/>
+          <w:noProof/>
+          <w:sz w:val="26"/>
+          <w:szCs w:val="26"/>
+        </w:rPr>
+      </w:pPr>
+      <w:r>
+        <w:rPr>
+          <w:rFonts w:ascii="Times New Roman" w:hAnsi="Times New Roman"/>
+          <w:noProof/>
+          <w:sz w:val="26"/>
+          <w:szCs w:val="26"/>
+        </w:rPr>
+        <w:t>Chương 3: Xây dựng chương trình</w:t>
       </w:r>
     </w:p>
     <w:p>
@@ -1775,7 +1832,7 @@
           <w:sz w:val="26"/>
           <w:szCs w:val="26"/>
         </w:rPr>
-        <w:t>Cài đặt mô-đun tính toán nhu cầu dinh dưỡng: hiện thực các công thức BMI, BMR và TDEE, quy đổi ra hạn mức năng lượng và tỷ lệ chất sinh năng lượng cho từng bữa ăn theo mục tiêu sức khỏe của người dùng;</w:t>
+        <w:t>Xây dựng tập dữ liệu dinh dưỡng: thu thập thông tin món ăn Việt Nam từ Bảng thành phần thực phẩm Việt Nam và các nguồn dữ liệu mở, sau đó chuẩn hóa đơn vị, xử lý dữ liệu khuyết và mã hóa đặc trưng theo phương pháp đã trình bày ở Chương 1;</w:t>
       </w:r>
     </w:p>
     <w:p>
@@ -1804,7 +1861,7 @@
           <w:sz w:val="26"/>
           <w:szCs w:val="26"/>
         </w:rPr>
-        <w:t>Cài đặt mô-đun khuyến nghị: trích chọn và chuẩn hóa vector đặc trưng món ăn, xây dựng hồ sơ sở thích người dùng, huấn luyện mô hình học máy có giám sát để dự đoán mức độ ưa thích, và cài đặt thuật toán lựa chọn tổ hợp món thỏa mãn ràng buộc dinh dưỡng;</w:t>
+        <w:t>Cài đặt mô-đun tính toán nhu cầu dinh dưỡng: hiện thực các công thức BMI, BMR và TDEE, quy đổi ra hạn mức năng lượng và tỷ lệ chất sinh năng lượng cho từng bữa ăn theo mục tiêu sức khỏe của người dùng;</w:t>
       </w:r>
     </w:p>
     <w:p>
@@ -1833,17 +1890,7 @@
           <w:sz w:val="26"/>
           <w:szCs w:val="26"/>
         </w:rPr>
-        <w:t xml:space="preserve">Cài đặt cơ chế học từ lịch sử người dùng: cập nhật hồ sơ sở thích theo phương pháp tăng dần sau mỗi lượt tương tác; thống nhất các nguồn tín hiệu khác nhau gồm kết quả tương tác thăm dò, món được giữ lại trong thực đơn, món bị thay thế, món đã ăn thực tế và điểm đánh giá sau khi ăn về một thang điểm ưa thích chung dùng làm nhãn huấn luyện; huấn luyện lại mô hình học máy có giám sát theo dữ liệu phản hồi tích lũy và chuyển tiếp dần từ phương pháp chấm điểm theo độ tương đồng sang mô hình học máy; áp dụng chiến lược thăm dò theo tỷ lệ nhằm tránh hiện tượng </w:t>
-      </w:r>
-      <w:r>
-        <w:rPr>
-          <w:rFonts w:ascii="Times New Roman" w:hAnsi="Times New Roman"/>
-          <w:noProof/>
-          <w:sz w:val="26"/>
-          <w:szCs w:val="26"/>
-        </w:rPr>
-        <w:lastRenderedPageBreak/>
-        <w:t>bong bóng lọc và bảo đảm dữ liệu huấn luyện tiếp tục được làm mới, qua đó nâng dần mức độ cá nhân hóa theo thời gian;</w:t>
+        <w:t>Cài đặt mô-đun khuyến nghị: trích chọn và chuẩn hóa vector đặc trưng món ăn, xây dựng hồ sơ sở thích người dùng, huấn luyện mô hình học máy có giám sát để dự đoán mức độ ưa thích, và cài đặt thuật toán lựa chọn tổ hợp món thỏa mãn ràng buộc dinh dưỡng;</w:t>
       </w:r>
     </w:p>
     <w:p>
@@ -1872,7 +1919,26 @@
           <w:sz w:val="26"/>
           <w:szCs w:val="26"/>
         </w:rPr>
-        <w:t>Xây dựng dịch vụ phía máy chủ và ứng dụng di động: hiện thực các nhóm giao diện lập trình phục vụ nghiệp vụ đã thiết kế, và xây dựng các màn hình khai báo hồ sơ, thực đơn hằng ngày, chi tiết món ăn, nhật ký ăn uống và thống kê tiến trình;</w:t>
+        <w:lastRenderedPageBreak/>
+        <w:t xml:space="preserve">Cài đặt cơ chế học từ lịch sử người dùng: cập nhật hồ sơ sở thích theo phương pháp tăng dần sau mỗi tín hiệu phản hồi mới; thống nhất các nguồn tín hiệu khác nhau gồm kết quả tương tác thăm dò ban đầu, món được giữ lại trong thực đơn, món bị thay thế và điểm đánh giá sau khi ăn về một thang điểm ưa thích chung dùng làm nhãn huấn luyện; huấn luyện lại mô hình học máy có giám sát theo dữ liệu phản hồi tích lũy và chuyển tiếp dần từ phương pháp chấm điểm theo độ tương đồng sang mô hình học máy; cài đặt cơ chế khai thác – thăm dò bằng nhiễu vector sở thích nhằm tránh </w:t>
+      </w:r>
+      <w:r>
+        <w:rPr>
+          <w:rFonts w:ascii="Times New Roman" w:hAnsi="Times New Roman"/>
+          <w:noProof/>
+          <w:sz w:val="26"/>
+          <w:szCs w:val="26"/>
+        </w:rPr>
+        <w:t>hiện tượng bong bóng lọc,</w:t>
+      </w:r>
+      <w:r>
+        <w:rPr>
+          <w:rFonts w:ascii="Times New Roman" w:hAnsi="Times New Roman"/>
+          <w:noProof/>
+          <w:sz w:val="26"/>
+          <w:szCs w:val="26"/>
+        </w:rPr>
+        <w:t xml:space="preserve"> và hiệu chỉnh biên độ nhiễu cùng tỷ lệ thăm dò bằng thực nghiệm, qua đó nâng dần mức độ cá nhân hóa theo thời gian;</w:t>
       </w:r>
     </w:p>
     <w:p>
@@ -1901,7 +1967,7 @@
           <w:sz w:val="26"/>
           <w:szCs w:val="26"/>
         </w:rPr>
-        <w:t>Thực nghiệm và đánh giá: đánh giá mô hình khuyến nghị trên tập dữ liệu kiểm thử theo các độ đo Precision@K, Recall@K và NDCG; so sánh với phương án khuyến nghị chỉ dựa trên quy tắc dinh dưỡng để làm rõ đóng góp của thành phần học máy; kiểm thử chức năng, hiệu năng và khảo sát mức độ hài lòng của người dùng thử nghiệm;</w:t>
+        <w:t>Xây dựng dịch vụ phía máy chủ và ứng dụng di động: hiện thực các nhóm giao diện lập trình phục vụ nghiệp vụ đã thiết kế, và xây dựng các màn hình khai báo hồ sơ, thực đơn hằng ngày, chi tiết món ăn, nhật ký ăn uống và thống kê tiến trình;</w:t>
       </w:r>
     </w:p>
     <w:p>
@@ -1930,11 +1996,40 @@
           <w:sz w:val="26"/>
           <w:szCs w:val="26"/>
         </w:rPr>
-        <w:t>Phân tích kết quả thực nghiệm, chỉ ra ưu điểm và hạn chế của mô hình đã xây dựng.</w:t>
+        <w:t>Thực nghiệm và đánh giá: đánh giá mô hình khuyến nghị trên tập dữ liệu kiểm thử theo các độ đo Precision@K, Recall@K và NDCG; so sánh với phương án khuyến nghị chỉ dựa trên quy tắc dinh dưỡng để làm rõ đóng góp của thành phần học máy; kiểm thử chức năng, hiệu năng và khảo sát mức độ hài lòng của người dùng thử nghiệm;</w:t>
       </w:r>
     </w:p>
     <w:p>
       <w:pPr>
+        <w:pStyle w:val="ListParagraph"/>
+        <w:numPr>
+          <w:ilvl w:val="0"/>
+          <w:numId w:val="10"/>
+        </w:numPr>
+        <w:tabs>
+          <w:tab w:val="left" w:leader="dot" w:pos="8931"/>
+        </w:tabs>
+        <w:spacing w:before="240" w:after="0" w:line="312" w:lineRule="auto"/>
+        <w:jc w:val="both"/>
+        <w:rPr>
+          <w:rFonts w:ascii="Times New Roman" w:hAnsi="Times New Roman"/>
+          <w:noProof/>
+          <w:sz w:val="26"/>
+          <w:szCs w:val="26"/>
+        </w:rPr>
+      </w:pPr>
+      <w:r>
+        <w:rPr>
+          <w:rFonts w:ascii="Times New Roman" w:hAnsi="Times New Roman"/>
+          <w:noProof/>
+          <w:sz w:val="26"/>
+          <w:szCs w:val="26"/>
+        </w:rPr>
+        <w:t>Phân tích kết quả thực nghiệm, chỉ ra ưu điểm và hạn chế của mô hình đã xây dựng.</w:t>
+      </w:r>
+    </w:p>
+    <w:p>
+      <w:pPr>
         <w:tabs>
           <w:tab w:val="left" w:leader="dot" w:pos="8931"/>
         </w:tabs>
@@ -1955,7 +2050,45 @@
           <w:sz w:val="26"/>
           <w:szCs w:val="26"/>
         </w:rPr>
-        <w:t>Trên cơ sở kết quả thực nghiệm, đồ án đánh giá ưu điểm của mô hình đã đề xuất, đặc biệt là khả năng bảo đảm đồng thời hai yêu cầu vốn mâu thuẫn nhau là thực đơn hợp khẩu vị người dùng và thực đơn thỏa mãn ràng buộc dinh dưỡng theo mục tiêu sức khỏe; cùng với đó là cơ chế xử lý bài toán khởi đầu nguội thông qua phiên tương tác thăm dò được bố trí ngay tại bước khởi tạo tài khoản, cho phép hệ thống cá nhân hóa thực đơn ngay từ lần sử dụng đầu tiên mà không cần chờ tích lũy lịch sử, đồng thời chuyển tiếp dần sang mô hình học máy có giám sát khi dữ liệu phản hồi thực tế đã đủ lớn. Đồ án cũng chỉ ra những hạn chế còn tồn tại như quy mô tập dữ liệu món ăn còn giới hạn, dữ liệu phản hồi được thu thập trong thời gian ngắn và trên một nhóm người dùng thử nghiệm nhỏ nên mức độ cá nhân hóa của mô hình học máy chưa đạt mức tối đa, và chất lượng hồ sơ sở thích ban đầu còn phụ thuộc vào mức độ nghiêm túc của người dùng khi thực hiện phiên tương tác thăm dò. Từ những hạn chế đó, đồ án đề xuất các hướng phát triển tiếp theo: về dữ liệu, mở rộng cơ sở dữ liệu món ăn theo vùng miền và bổ sung các món ăn ngoài hàng quán nhằm tăng tính đa dạng của thực đơn; về mô hình, phân cụm hồ sơ sở thích nhằm xác định các nhóm khẩu vị đặc trưng để rút ngắn hơn nữa giai đoạn khởi đầu nguội, bổ sung thành phần lọc cộng tác khi số lượng người dùng đủ lớn để chuyển sang mô hình lai ghép, và nghiên cứu áp dụng học tăng cường nhằm tối ưu khuyến nghị theo phản hồi dài hạn của người dùng; về chức năng, tích hợp nhận diện món ăn từ hình ảnh để rút ngắn thao tác ghi nhật ký, kết nối thiết bị đeo thông minh nhằm thay hệ số vận động ước lượng bằng dữ liệu vận động thực tế, và sinh danh sách nguyên liệu đi chợ theo thực đơn tuần; về phạm vi áp dụng, bổ sung bộ ràng buộc dinh dưỡng chuyên biệt cho các nhóm người dùng có bệnh lý.</w:t>
+        <w:t xml:space="preserve">Trên cơ sở kết quả thực nghiệm, đồ án đánh giá ưu điểm của mô hình đã đề xuất, đặc biệt là khả năng bảo đảm đồng thời hai yêu cầu vốn mâu thuẫn nhau là thực đơn hợp khẩu vị người dùng và thực đơn thỏa mãn ràng buộc dinh dưỡng theo mục tiêu sức khỏe; cùng với đó là cơ chế xử lý bài toán </w:t>
+      </w:r>
+      <w:r>
+        <w:rPr>
+          <w:rFonts w:ascii="Times New Roman" w:hAnsi="Times New Roman"/>
+          <w:noProof/>
+          <w:sz w:val="26"/>
+          <w:szCs w:val="26"/>
+        </w:rPr>
+        <w:t>Cold</w:t>
+      </w:r>
+      <w:r>
+        <w:rPr>
+          <w:rFonts w:ascii="Times New Roman" w:hAnsi="Times New Roman"/>
+          <w:noProof/>
+          <w:sz w:val="26"/>
+          <w:szCs w:val="26"/>
+          <w:lang w:val="vi-VN"/>
+        </w:rPr>
+        <w:t>-Start</w:t>
+      </w:r>
+      <w:r>
+        <w:rPr>
+          <w:rFonts w:ascii="Times New Roman" w:hAnsi="Times New Roman"/>
+          <w:noProof/>
+          <w:sz w:val="26"/>
+          <w:szCs w:val="26"/>
+        </w:rPr>
+        <w:t xml:space="preserve"> thông qua phiên tương tác thăm dò được bố trí ngay tại bước khởi tạo tài khoản. Đồ án cũng chỉ ra những hạn chế còn tồn tại như quy mô tập dữ liệu món ăn còn giới hạn, dữ liệu phản hồi được thu thập trong thời gian ngắn và trên một nhóm người dùng thử nghiệm nhỏ nên mức độ cá nhân hóa của mô hình học máy chưa đạt mức tối đa, và chất lượng hồ sơ sở thích ban đầu còn phụ thuộc vào mức độ nghiêm túc của người dùng khi thực hiện phiên tương tác thăm dò. Từ những hạn chế đó, đồ án đề xuất các hướng phát triển tiếp theo: về dữ liệu, mở rộng cơ sở dữ liệu món ăn theo vùng miền và bổ sung các món ăn ngoài hàng quán nhằm tăng tính đa dạng của thực đơn; về mô hình, phân cụm hồ sơ sở thích nhằm xác định các nhóm khẩu vị đặc trưng để rút ngắn hơn nữa giai đoạn khởi đầu nguội, bổ sung thành phần lọc cộng tác khi số lượng người dùng đủ lớn để chuyển sang mô hình lai ghép, và nghiên cứu áp dụng học tăng cường nhằm tối ưu khuyến nghị theo phản hồi </w:t>
+      </w:r>
+      <w:r>
+        <w:rPr>
+          <w:rFonts w:ascii="Times New Roman" w:hAnsi="Times New Roman"/>
+          <w:noProof/>
+          <w:sz w:val="26"/>
+          <w:szCs w:val="26"/>
+        </w:rPr>
+        <w:lastRenderedPageBreak/>
+        <w:t>dài hạn của người dùng; về chức năng, tích hợp nhận diện món ăn từ hình ảnh để rút ngắn thao tác ghi nhật ký, kết nối thiết bị đeo thông minh nhằm thay hệ số vận động ước lượng bằng dữ liệu vận động thực tế, và sinh danh sách nguyên liệu đi chợ theo thực đơn tuần; về phạm vi áp dụng, bổ sung bộ ràng buộc dinh dưỡng chuyên biệt cho các nhóm người dùng có bệnh lý.</w:t>
       </w:r>
     </w:p>
     <w:p>

</xml_diff>

<commit_message>
docs: complete initial data and reference list in DATN task sheet
</commit_message>
<xml_diff>
--- a/BAOCAO/DE_CUONG_DATN_TranLamNghia.docx
+++ b/BAOCAO/DE_CUONG_DATN_TranLamNghia.docx
@@ -136,7 +136,7 @@
                 </mc:Choice>
                 <mc:Fallback>
                   <w:pict>
-                    <v:shapetype w14:anchorId="1FC45A18" id="_x0000_t32" coordsize="21600,21600" o:spt="32" o:oned="t" path="m,l21600,21600e" filled="f">
+                    <v:shapetype w14:anchorId="2988CC32" id="_x0000_t32" coordsize="21600,21600" o:spt="32" o:oned="t" path="m,l21600,21600e" filled="f">
                       <v:path arrowok="t" fillok="f" o:connecttype="none"/>
                       <o:lock v:ext="edit" shapetype="t"/>
                     </v:shapetype>
@@ -287,7 +287,7 @@
                 </mc:Choice>
                 <mc:Fallback>
                   <w:pict>
-                    <v:shape w14:anchorId="6D996260" id="AutoShape 4" o:spid="_x0000_s1026" type="#_x0000_t32" style="position:absolute;margin-left:60.35pt;margin-top:15.9pt;width:155.9pt;height:0;z-index:251657216;visibility:visible;mso-wrap-style:square;mso-width-percent:0;mso-height-percent:0;mso-wrap-distance-left:9pt;mso-wrap-distance-top:0;mso-wrap-distance-right:9pt;mso-wrap-distance-bottom:0;mso-position-horizontal:absolute;mso-position-horizontal-relative:text;mso-position-vertical:absolute;mso-position-vertical-relative:text;mso-width-percent:0;mso-height-percent:0;mso-width-relative:page;mso-height-relative:page" o:gfxdata="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"/>
+                    <v:shape w14:anchorId="1484D85A" id="AutoShape 4" o:spid="_x0000_s1026" type="#_x0000_t32" style="position:absolute;margin-left:60.35pt;margin-top:15.9pt;width:155.9pt;height:0;z-index:251657216;visibility:visible;mso-wrap-style:square;mso-width-percent:0;mso-height-percent:0;mso-wrap-distance-left:9pt;mso-wrap-distance-top:0;mso-wrap-distance-right:9pt;mso-wrap-distance-bottom:0;mso-position-horizontal:absolute;mso-position-horizontal-relative:text;mso-position-vertical:absolute;mso-position-vertical-relative:text;mso-width-percent:0;mso-height-percent:0;mso-width-relative:page;mso-height-relative:page" o:gfxdata="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"/>
                   </w:pict>
                 </mc:Fallback>
               </mc:AlternateContent>
@@ -1213,7 +1213,7 @@
           <w:sz w:val="26"/>
           <w:szCs w:val="26"/>
         </w:rPr>
-        <w:t>Lý thuyết về hệ khuyến nghị (Recommender System): phát biểu bài toán khuyến nghị dưới dạng dự đoán mức độ ưa thích của người dùng đối với một đối tượng chưa từng tương tác, từ đó xếp hạng và chọn ra danh sách gợi ý; ba nhóm phương pháp cơ bản gồm lọc theo nội dung (content-based filtering – gợi ý dựa trên sự tương đồng về đặc trưng giữa đối tượng mới và những đối tượng người dùng đã thích), lọc cộng tác (collaborative filtering – gợi ý dựa trên hành vi của những người dùng có sở thích tương tự) và phương pháp lai ghép (hybrid); các hạn chế điển hình như thưa dữ liệu (sparsity) và khởi đầu nguội (cold-start – chưa có lịch sử tương tác của người dùng mới);</w:t>
+        <w:t>Lý thuyết về hệ khuyến nghị (Recommender System): phát biểu bài toán khuyến nghị dưới dạng dự đoán mức độ ưa thích của người dùng đối với một đối tượng chưa từng tương tác, từ đó xếp hạng và chọn ra danh sách gợi ý; các hạn chế điển hình như thưa dữ liệu (sparsity) và khởi đầu nguội (cold-start – chưa có lịch sử tương tác của người dùng mới);</w:t>
       </w:r>
     </w:p>
     <w:p>
@@ -1242,7 +1242,7 @@
           <w:sz w:val="26"/>
           <w:szCs w:val="26"/>
         </w:rPr>
-        <w:t xml:space="preserve">Lý thuyết về khuyến nghị theo nội dung: biểu diễn mỗi món ăn thành một vector đặc trưng gồm thành phần dinh dưỡng, nhóm thực phẩm, phương pháp chế biến và khẩu vị; xây dựng hồ sơ sở thích của người dùng như vector trọng số tổng hợp từ lịch sử tương tác theo thuật toán Rocchio (Rocchio's algorithm – phương pháp phản hồi liên quan kinh điển trong </w:t>
+        <w:t xml:space="preserve">Lý thuyết về khuyến nghị theo nội dung: biểu diễn mỗi món ăn thành một vector đặc trưng gồm thành phần dinh dưỡng, nhóm thực phẩm, phương pháp chế biến và khẩu vị; xây dựng hồ sơ sở thích của người dùng như vector trọng số tổng hợp từ lịch sử tương tác theo thuật toán Rocchio (Rocchio's algorithm – phương pháp phản hồi liên quan kinh điển trong mô hình không gian vector, xác định vector sở thích bằng hiệu giữa trọng tâm của nhóm đối tượng người dùng ưa thích và trọng tâm của nhóm đối tượng người dùng không ưa thích), còn được biết đến trong học máy với tên gọi bộ phân lớp trọng tâm gần nhất (nearest centroid classifier); phân tích mối liên hệ giữa vector trọng số này với trọng số của một mô hình </w:t>
       </w:r>
       <w:r>
         <w:rPr>
@@ -1252,7 +1252,7 @@
           <w:szCs w:val="26"/>
         </w:rPr>
         <w:lastRenderedPageBreak/>
-        <w:t>mô hình không gian vector, xác định vector sở thích bằng hiệu giữa trọng tâm của nhóm đối tượng người dùng ưa thích và trọng tâm của nhóm đối tượng người dùng không ưa thích), còn được biết đến trong học máy với tên gọi bộ phân lớp trọng tâm gần nhất (nearest centroid classifier); phân tích mối liên hệ giữa vector trọng số này với trọng số của một mô hình phân lớp tuyến tính, trong đó nghiệm được xác định trực tiếp bằng công thức đóng thay vì tối ưu lặp, nhờ vậy ổn định và ít bị quá khớp khi số lượng mẫu quan sát còn ít; các độ đo tương đồng giữa hai vector gồm độ tương đồng cosin (cosine similarity – cosin của góc giữa hai vector, nhận giá trị từ −1 đến 1, càng gần 1 thì hai đối tượng càng giống nhau) và khoảng cách Euclid, kèm phân tích vai trò của bước căn giữa dữ liệu (mean centering) đối với khả năng phân biệt của độ đo cosin;</w:t>
+        <w:t>phân lớp tuyến tính, trong đó nghiệm được xác định trực tiếp bằng công thức đóng thay vì tối ưu lặp, nhờ vậy ổn định và ít bị quá khớp khi số lượng mẫu quan sát còn ít; các độ đo tương đồng giữa hai vector gồm độ tương đồng cosin (cosine similarity – cosin của góc giữa hai vector, nhận giá trị từ −1 đến 1, càng gần 1 thì hai đối tượng càng giống nhau) và khoảng cách Euclid, kèm phân tích vai trò của bước căn giữa dữ liệu (mean centering) đối với khả năng phân biệt của độ đo cosin;</w:t>
       </w:r>
     </w:p>
     <w:p>
@@ -1368,17 +1368,7 @@
           <w:sz w:val="26"/>
           <w:szCs w:val="26"/>
         </w:rPr>
-        <w:t xml:space="preserve">Lý thuyết về tiền xử lý và biểu diễn dữ liệu: làm sạch và xử lý dữ liệu khuyết, chuẩn hóa dữ liệu số theo min-max hoặc z-score để các thành phần dinh dưỡng có cùng thang đo, mã hóa one-hot cho đặc trưng phân loại, và khai thác phản hồi ngầm định (implicit feedback – thông tin sở </w:t>
-      </w:r>
-      <w:r>
-        <w:rPr>
-          <w:rFonts w:ascii="Times New Roman" w:hAnsi="Times New Roman"/>
-          <w:noProof/>
-          <w:sz w:val="26"/>
-          <w:szCs w:val="26"/>
-        </w:rPr>
-        <w:lastRenderedPageBreak/>
-        <w:t>thích suy ra gián tiếp từ hành vi như chọn, bỏ qua hay thay thế món ăn, thay cho việc chấm điểm trực tiếp);</w:t>
+        <w:t>Lý thuyết về tiền xử lý và biểu diễn dữ liệu: làm sạch và xử lý dữ liệu khuyết, chuẩn hóa dữ liệu số theo min-max hoặc z-score để các thành phần dinh dưỡng có cùng thang đo, mã hóa one-hot cho đặc trưng phân loại, và khai thác phản hồi ngầm định (implicit feedback – thông tin sở thích suy ra gián tiếp từ hành vi như chọn, bỏ qua hay thay thế món ăn, thay cho việc chấm điểm trực tiếp);</w:t>
       </w:r>
     </w:p>
     <w:p>
@@ -1407,7 +1397,17 @@
           <w:sz w:val="26"/>
           <w:szCs w:val="26"/>
         </w:rPr>
-        <w:t>Tổng quan công nghệ sử dụng để hiện thực hóa cơ sở lý thuyết trên: nền tảng phát triển ứng dụng di động đa nền tảng Flutter, kiến trúc dịch vụ RESTful với ASP.NET Core Web API và hệ quản trị cơ sở dữ liệu quan hệ; các vấn đề an toàn, bảo mật đối với dữ liệu sức khỏe cá nhân.</w:t>
+        <w:t xml:space="preserve">Tổng quan công nghệ sử dụng để hiện thực hóa cơ sở lý thuyết trên: nền tảng phát triển ứng dụng di động đa nền tảng Flutter, kiến trúc dịch vụ </w:t>
+      </w:r>
+      <w:r>
+        <w:rPr>
+          <w:rFonts w:ascii="Times New Roman" w:hAnsi="Times New Roman"/>
+          <w:noProof/>
+          <w:sz w:val="26"/>
+          <w:szCs w:val="26"/>
+        </w:rPr>
+        <w:lastRenderedPageBreak/>
+        <w:t>RESTful với ASP.NET Core Web API và hệ quản trị cơ sở dữ liệu quan hệ; các vấn đề an toàn, bảo mật đối với dữ liệu sức khỏe cá nhân.</w:t>
       </w:r>
     </w:p>
     <w:p>
@@ -1518,7 +1518,7 @@
           <w:sz w:val="26"/>
           <w:szCs w:val="26"/>
         </w:rPr>
-        <w:t>Phân tích yêu cầu phi chức năng: độ chính xác của khuyến nghị, thời gian đáp ứng, tính bảo mật của dữ liệu sức khỏe cá nhân, khả năng mở rộng và tính dễ sử dụng của giao diện;</w:t>
+        <w:t>Mô hình hóa hệ thống theo phương pháp hướng đối tượng với ngôn ngữ UML: xây dựng biểu đồ use case và đặc tả các use case chính; biểu đồ lớp thể hiện các thực thể nghiệp vụ; biểu đồ hoạt động và biểu đồ tuần tự mô tả luồng xử lý sinh thực đơn và luồng cập nhật theo phản hồi người dùng;</w:t>
       </w:r>
     </w:p>
     <w:p>
@@ -1547,7 +1547,7 @@
           <w:sz w:val="26"/>
           <w:szCs w:val="26"/>
         </w:rPr>
-        <w:t>Mô hình hóa hệ thống theo phương pháp hướng đối tượng với ngôn ngữ UML: xây dựng biểu đồ use case và đặc tả các use case chính; biểu đồ lớp thể hiện các thực thể nghiệp vụ; biểu đồ hoạt động và biểu đồ tuần tự mô tả luồng xử lý sinh thực đơn và luồng cập nhật theo phản hồi người dùng;</w:t>
+        <w:t>Thiết kế kiến trúc hệ thống theo mô hình phân tầng: tầng giao diện trên thiết bị di động, tầng dịch vụ nghiệp vụ, tầng khuyến nghị và tầng lưu trữ dữ liệu; phân tích lý do lựa chọn kiến trúc và cách các tầng trao đổi dữ liệu;</w:t>
       </w:r>
     </w:p>
     <w:p>
@@ -1576,7 +1576,7 @@
           <w:sz w:val="26"/>
           <w:szCs w:val="26"/>
         </w:rPr>
-        <w:t>Thiết kế kiến trúc hệ thống theo mô hình phân tầng: tầng giao diện trên thiết bị di động, tầng dịch vụ nghiệp vụ, tầng khuyến nghị và tầng lưu trữ dữ liệu; phân tích lý do lựa chọn kiến trúc và cách các tầng trao đổi dữ liệu;</w:t>
+        <w:t>Thiết kế cơ sở dữ liệu: xây dựng mô hình thực thể – liên kết cho các thực thể người dùng, hồ sơ sức khỏe, món ăn, thành phần dinh dưỡng, thực đơn, nhật ký ăn uống và lịch sử phản hồi; chuẩn hóa lược đồ quan hệ nhằm loại bỏ dư thừa dữ liệu;</w:t>
       </w:r>
     </w:p>
     <w:p>
@@ -1605,7 +1605,7 @@
           <w:sz w:val="26"/>
           <w:szCs w:val="26"/>
         </w:rPr>
-        <w:t>Thiết kế cơ sở dữ liệu: xây dựng mô hình thực thể – liên kết cho các thực thể người dùng, hồ sơ sức khỏe, món ăn, thành phần dinh dưỡng, thực đơn, nhật ký ăn uống và lịch sử phản hồi; chuẩn hóa lược đồ quan hệ nhằm loại bỏ dư thừa dữ liệu;</w:t>
+        <w:t>Thiết kế thuật toán khuyến nghị: mô tả quy trình bốn bước gồm tính hạn mức năng lượng và dinh dưỡng từ hồ sơ người dùng, lọc bỏ các món vi phạm ràng buộc cứng, chấm điểm mức độ phù hợp bằng mô hình học máy, và lựa chọn tổ hợp món cho từng bữa thỏa mãn ràng buộc dinh dưỡng bằng thuật toán tham lam theo mật độ điểm kết hợp tìm kiếm cục bộ trên hàm mục tiêu có thành phần phạt; xác định đầu vào, đầu ra và độ phức tạp của từng bước;</w:t>
       </w:r>
     </w:p>
     <w:p>
@@ -1634,7 +1634,55 @@
           <w:sz w:val="26"/>
           <w:szCs w:val="26"/>
         </w:rPr>
-        <w:t>Thiết kế thuật toán khuyến nghị: mô tả quy trình bốn bước gồm tính hạn mức năng lượng và dinh dưỡng từ hồ sơ người dùng, lọc bỏ các món vi phạm ràng buộc cứng, chấm điểm mức độ phù hợp bằng mô hình học máy, và lựa chọn tổ hợp món cho từng bữa thỏa mãn ràng buộc dinh dưỡng bằng thuật toán tham lam theo mật độ điểm kết hợp tìm kiếm cục bộ trên hàm mục tiêu có thành phần phạt; xác định đầu vào, đầu ra và độ phức tạp của từng bước;</w:t>
+        <w:t xml:space="preserve">Thiết kế cơ chế giải quyết bài toán </w:t>
+      </w:r>
+      <w:r>
+        <w:rPr>
+          <w:rFonts w:ascii="Times New Roman" w:hAnsi="Times New Roman"/>
+          <w:noProof/>
+          <w:sz w:val="26"/>
+          <w:szCs w:val="26"/>
+          <w:lang w:val="vi-VN"/>
+        </w:rPr>
+        <w:t>Cold-Start</w:t>
+      </w:r>
+      <w:r>
+        <w:rPr>
+          <w:rFonts w:ascii="Times New Roman" w:hAnsi="Times New Roman"/>
+          <w:noProof/>
+          <w:sz w:val="26"/>
+          <w:szCs w:val="26"/>
+        </w:rPr>
+        <w:t xml:space="preserve">: hệ thống vận hành theo ba giai đoạn tương ứng với độ trưởng thành dữ liệu của từng người dùng — giai đoạn thứ nhất chỉ có hồ sơ sức khỏe nên chấm điểm theo quy tắc dinh dưỡng và mức độ phổ biến chung của món ăn; giai đoạn thứ hai bắt đầu ngay sau khi người dùng hoàn tất phiên tương tác thăm dò, trong đó người dùng đánh giá nhanh từng món bằng thao tác vuốt theo bốn mức thích, không thích, bình thường và chưa biết, trên một tập món được chọn theo nguyên tắc cực đại hóa độ đa dạng nhằm thu được lượng thông tin </w:t>
+      </w:r>
+      <w:r>
+        <w:rPr>
+          <w:rFonts w:ascii="Times New Roman" w:hAnsi="Times New Roman"/>
+          <w:noProof/>
+          <w:sz w:val="26"/>
+          <w:szCs w:val="26"/>
+        </w:rPr>
+        <w:lastRenderedPageBreak/>
+        <w:t xml:space="preserve">lớn nhất trên mỗi lượt tương tác, từ đó dựng hồ sơ sở thích ban đầu và chấm điểm bằng độ tương đồng cosin; giai đoạn thứ ba chuyển sang mô hình học máy có giám sát khi người dùng đã tích lũy đủ dữ liệu nhật ký ăn uống và đánh giá thực tế; thiết kế cơ chế chuyển tiếp dần giữa hai phương pháp chấm điểm bằng hệ số trộn phụ thuộc số lượng tín hiệu đã thu thập, nhằm tránh thay đổi đột ngột trong trải nghiệm của người dùng; phiên tương tác thăm dò chỉ được thực hiện một lần duy nhất tại bước khởi tạo tài khoản, sau đó hệ thống hoàn toàn học từ hành vi thực tế của người dùng đối với thực đơn được gợi </w:t>
+      </w:r>
+      <w:r>
+        <w:rPr>
+          <w:rFonts w:ascii="Times New Roman" w:hAnsi="Times New Roman"/>
+          <w:noProof/>
+          <w:sz w:val="26"/>
+          <w:szCs w:val="26"/>
+        </w:rPr>
+        <w:t>ý</w:t>
+      </w:r>
+      <w:r>
+        <w:rPr>
+          <w:rFonts w:ascii="Times New Roman" w:hAnsi="Times New Roman"/>
+          <w:noProof/>
+          <w:sz w:val="26"/>
+          <w:szCs w:val="26"/>
+          <w:lang w:val="vi-VN"/>
+        </w:rPr>
+        <w:t>.</w:t>
       </w:r>
     </w:p>
     <w:p>
@@ -1663,36 +1711,16 @@
           <w:sz w:val="26"/>
           <w:szCs w:val="26"/>
         </w:rPr>
-        <w:lastRenderedPageBreak/>
-        <w:t xml:space="preserve">Thiết kế cơ chế giải quyết bài toán </w:t>
-      </w:r>
-      <w:r>
-        <w:rPr>
-          <w:rFonts w:ascii="Times New Roman" w:hAnsi="Times New Roman"/>
-          <w:noProof/>
-          <w:sz w:val="26"/>
-          <w:szCs w:val="26"/>
-          <w:lang w:val="vi-VN"/>
-        </w:rPr>
-        <w:t>Cold-Start</w:t>
-      </w:r>
-      <w:r>
-        <w:rPr>
-          <w:rFonts w:ascii="Times New Roman" w:hAnsi="Times New Roman"/>
-          <w:noProof/>
-          <w:sz w:val="26"/>
-          <w:szCs w:val="26"/>
-        </w:rPr>
-        <w:t xml:space="preserve">: hệ thống vận hành theo ba giai đoạn tương ứng với độ trưởng thành dữ liệu của từng người dùng — giai đoạn thứ nhất chỉ có hồ sơ sức khỏe nên chấm điểm theo quy tắc dinh dưỡng và mức độ phổ biến chung của món ăn; giai đoạn thứ hai bắt đầu ngay sau khi người dùng hoàn tất phiên tương tác thăm dò, trong đó người dùng đánh giá nhanh từng món bằng thao tác vuốt theo bốn mức thích, không thích, bình thường và chưa biết, trên một tập món được chọn theo nguyên tắc cực đại hóa độ đa dạng nhằm thu được lượng thông tin lớn nhất trên mỗi lượt tương tác, từ đó dựng hồ sơ sở thích ban đầu và chấm điểm bằng độ tương đồng cosin; giai đoạn thứ ba chuyển sang mô hình học máy có giám sát khi người dùng đã tích lũy đủ dữ liệu nhật ký ăn uống và đánh giá thực tế; thiết kế cơ chế chuyển tiếp dần giữa hai phương pháp chấm điểm bằng hệ số trộn phụ thuộc số lượng tín hiệu đã thu thập, nhằm tránh thay đổi đột ngột trong trải nghiệm của người dùng; phiên tương tác thăm dò chỉ được thực hiện một lần duy nhất tại bước khởi tạo tài khoản, sau đó hệ thống hoàn toàn học từ hành vi thực tế của người dùng đối với thực đơn được gợi </w:t>
-      </w:r>
-      <w:r>
-        <w:rPr>
-          <w:rFonts w:ascii="Times New Roman" w:hAnsi="Times New Roman"/>
-          <w:noProof/>
-          <w:sz w:val="26"/>
-          <w:szCs w:val="26"/>
-        </w:rPr>
-        <w:t>ý</w:t>
+        <w:t xml:space="preserve">Thiết kế cơ chế chống suy giảm đa dạng của thực đơn: chia số suất trong mỗi thực đơn thành nhóm khai thác và nhóm thăm dò, trong đó nhóm khai thác được xếp hạng theo vector sở thích của người dùng, còn nhóm thăm dò được xếp hạng theo chính vector đó sau khi làm nhiễu nhẹ, nhằm gợi ý những món nằm ở vùng lân cận khẩu vị thay vì những món ngẫu </w:t>
+      </w:r>
+      <w:r>
+        <w:rPr>
+          <w:rFonts w:ascii="Times New Roman" w:hAnsi="Times New Roman"/>
+          <w:noProof/>
+          <w:sz w:val="26"/>
+          <w:szCs w:val="26"/>
+        </w:rPr>
+        <w:t>nhiên</w:t>
       </w:r>
       <w:r>
         <w:rPr>
@@ -1731,26 +1759,31 @@
           <w:sz w:val="26"/>
           <w:szCs w:val="26"/>
         </w:rPr>
-        <w:t xml:space="preserve">Thiết kế cơ chế chống suy giảm đa dạng của thực đơn: chia số suất trong mỗi thực đơn thành nhóm khai thác và nhóm thăm dò, trong đó nhóm khai thác được xếp hạng theo vector sở thích của người dùng, còn nhóm thăm dò được xếp hạng theo chính vector đó sau khi làm nhiễu nhẹ, nhằm gợi ý những món nằm ở vùng lân cận khẩu vị thay vì những món ngẫu </w:t>
-      </w:r>
-      <w:r>
-        <w:rPr>
-          <w:rFonts w:ascii="Times New Roman" w:hAnsi="Times New Roman"/>
-          <w:noProof/>
-          <w:sz w:val="26"/>
-          <w:szCs w:val="26"/>
-        </w:rPr>
-        <w:t>nhiên</w:t>
-      </w:r>
-      <w:r>
-        <w:rPr>
-          <w:rFonts w:ascii="Times New Roman" w:hAnsi="Times New Roman"/>
-          <w:noProof/>
-          <w:sz w:val="26"/>
-          <w:szCs w:val="26"/>
-          <w:lang w:val="vi-VN"/>
-        </w:rPr>
-        <w:t>.</w:t>
+        <w:t>Thiết kế giao diện người dùng: sơ đồ luồng màn hình và bản thiết kế các màn hình chính theo nguyên tắc bảo đảm tính nhất quán và dễ thao tác.</w:t>
+      </w:r>
+    </w:p>
+    <w:p>
+      <w:pPr>
+        <w:tabs>
+          <w:tab w:val="left" w:leader="dot" w:pos="8931"/>
+        </w:tabs>
+        <w:spacing w:before="240" w:after="0" w:line="312" w:lineRule="auto"/>
+        <w:ind w:firstLine="720"/>
+        <w:rPr>
+          <w:rFonts w:ascii="Times New Roman" w:hAnsi="Times New Roman"/>
+          <w:noProof/>
+          <w:sz w:val="26"/>
+          <w:szCs w:val="26"/>
+        </w:rPr>
+      </w:pPr>
+      <w:r>
+        <w:rPr>
+          <w:rFonts w:ascii="Times New Roman" w:hAnsi="Times New Roman"/>
+          <w:noProof/>
+          <w:sz w:val="26"/>
+          <w:szCs w:val="26"/>
+        </w:rPr>
+        <w:t>Chương 3: Xây dựng chương trình</w:t>
       </w:r>
     </w:p>
     <w:p>
@@ -1779,31 +1812,7 @@
           <w:sz w:val="26"/>
           <w:szCs w:val="26"/>
         </w:rPr>
-        <w:t>Thiết kế giao diện người dùng: sơ đồ luồng màn hình và bản thiết kế các màn hình chính theo nguyên tắc bảo đảm tính nhất quán và dễ thao tác.</w:t>
-      </w:r>
-    </w:p>
-    <w:p>
-      <w:pPr>
-        <w:tabs>
-          <w:tab w:val="left" w:leader="dot" w:pos="8931"/>
-        </w:tabs>
-        <w:spacing w:before="240" w:after="0" w:line="312" w:lineRule="auto"/>
-        <w:ind w:firstLine="720"/>
-        <w:rPr>
-          <w:rFonts w:ascii="Times New Roman" w:hAnsi="Times New Roman"/>
-          <w:noProof/>
-          <w:sz w:val="26"/>
-          <w:szCs w:val="26"/>
-        </w:rPr>
-      </w:pPr>
-      <w:r>
-        <w:rPr>
-          <w:rFonts w:ascii="Times New Roman" w:hAnsi="Times New Roman"/>
-          <w:noProof/>
-          <w:sz w:val="26"/>
-          <w:szCs w:val="26"/>
-        </w:rPr>
-        <w:t>Chương 3: Xây dựng chương trình</w:t>
+        <w:t>Xây dựng tập dữ liệu dinh dưỡng: thu thập thông tin món ăn Việt Nam từ Bảng thành phần thực phẩm Việt Nam và các nguồn dữ liệu mở, sau đó chuẩn hóa đơn vị, xử lý dữ liệu khuyết và mã hóa đặc trưng theo phương pháp đã trình bày ở Chương 1;</w:t>
       </w:r>
     </w:p>
     <w:p>
@@ -1832,7 +1841,7 @@
           <w:sz w:val="26"/>
           <w:szCs w:val="26"/>
         </w:rPr>
-        <w:t>Xây dựng tập dữ liệu dinh dưỡng: thu thập thông tin món ăn Việt Nam từ Bảng thành phần thực phẩm Việt Nam và các nguồn dữ liệu mở, sau đó chuẩn hóa đơn vị, xử lý dữ liệu khuyết và mã hóa đặc trưng theo phương pháp đã trình bày ở Chương 1;</w:t>
+        <w:t>Cài đặt mô-đun tính toán nhu cầu dinh dưỡng: hiện thực các công thức BMI, BMR và TDEE, quy đổi ra hạn mức năng lượng và tỷ lệ chất sinh năng lượng cho từng bữa ăn theo mục tiêu sức khỏe của người dùng;</w:t>
       </w:r>
     </w:p>
     <w:p>
@@ -1861,7 +1870,7 @@
           <w:sz w:val="26"/>
           <w:szCs w:val="26"/>
         </w:rPr>
-        <w:t>Cài đặt mô-đun tính toán nhu cầu dinh dưỡng: hiện thực các công thức BMI, BMR và TDEE, quy đổi ra hạn mức năng lượng và tỷ lệ chất sinh năng lượng cho từng bữa ăn theo mục tiêu sức khỏe của người dùng;</w:t>
+        <w:t>Cài đặt mô-đun khuyến nghị: trích chọn và chuẩn hóa vector đặc trưng món ăn, xây dựng hồ sơ sở thích người dùng, huấn luyện mô hình học máy có giám sát để dự đoán mức độ ưa thích, và cài đặt thuật toán lựa chọn tổ hợp món thỏa mãn ràng buộc dinh dưỡng;</w:t>
       </w:r>
     </w:p>
     <w:p>
@@ -1890,7 +1899,35 @@
           <w:sz w:val="26"/>
           <w:szCs w:val="26"/>
         </w:rPr>
-        <w:t>Cài đặt mô-đun khuyến nghị: trích chọn và chuẩn hóa vector đặc trưng món ăn, xây dựng hồ sơ sở thích người dùng, huấn luyện mô hình học máy có giám sát để dự đoán mức độ ưa thích, và cài đặt thuật toán lựa chọn tổ hợp món thỏa mãn ràng buộc dinh dưỡng;</w:t>
+        <w:t xml:space="preserve">Cài đặt cơ chế học từ lịch sử người dùng: cập nhật hồ sơ sở thích theo phương pháp tăng dần sau mỗi tín hiệu phản hồi mới; thống nhất các nguồn tín hiệu khác nhau gồm kết quả tương tác thăm dò ban đầu, món được giữ lại trong thực đơn, món bị thay thế và điểm đánh giá sau khi ăn về một thang điểm ưa thích chung dùng làm nhãn huấn luyện; huấn luyện lại mô hình học máy có giám sát theo dữ liệu phản hồi tích lũy và chuyển tiếp dần từ phương pháp chấm điểm theo độ tương đồng sang mô hình học máy; cài đặt cơ chế khai thác – thăm dò bằng nhiễu vector sở thích </w:t>
+      </w:r>
+      <w:r>
+        <w:rPr>
+          <w:rFonts w:ascii="Times New Roman" w:hAnsi="Times New Roman"/>
+          <w:noProof/>
+          <w:sz w:val="26"/>
+          <w:szCs w:val="26"/>
+        </w:rPr>
+        <w:lastRenderedPageBreak/>
+        <w:t xml:space="preserve">nhằm tránh </w:t>
+      </w:r>
+      <w:r>
+        <w:rPr>
+          <w:rFonts w:ascii="Times New Roman" w:hAnsi="Times New Roman"/>
+          <w:noProof/>
+          <w:sz w:val="26"/>
+          <w:szCs w:val="26"/>
+        </w:rPr>
+        <w:t>hiện tượng bong bóng lọc,</w:t>
+      </w:r>
+      <w:r>
+        <w:rPr>
+          <w:rFonts w:ascii="Times New Roman" w:hAnsi="Times New Roman"/>
+          <w:noProof/>
+          <w:sz w:val="26"/>
+          <w:szCs w:val="26"/>
+        </w:rPr>
+        <w:t xml:space="preserve"> và hiệu chỉnh biên độ nhiễu cùng tỷ lệ thăm dò bằng thực nghiệm, qua đó nâng dần mức độ cá nhân hóa theo thời gian;</w:t>
       </w:r>
     </w:p>
     <w:p>
@@ -1919,26 +1956,7 @@
           <w:sz w:val="26"/>
           <w:szCs w:val="26"/>
         </w:rPr>
-        <w:lastRenderedPageBreak/>
-        <w:t xml:space="preserve">Cài đặt cơ chế học từ lịch sử người dùng: cập nhật hồ sơ sở thích theo phương pháp tăng dần sau mỗi tín hiệu phản hồi mới; thống nhất các nguồn tín hiệu khác nhau gồm kết quả tương tác thăm dò ban đầu, món được giữ lại trong thực đơn, món bị thay thế và điểm đánh giá sau khi ăn về một thang điểm ưa thích chung dùng làm nhãn huấn luyện; huấn luyện lại mô hình học máy có giám sát theo dữ liệu phản hồi tích lũy và chuyển tiếp dần từ phương pháp chấm điểm theo độ tương đồng sang mô hình học máy; cài đặt cơ chế khai thác – thăm dò bằng nhiễu vector sở thích nhằm tránh </w:t>
-      </w:r>
-      <w:r>
-        <w:rPr>
-          <w:rFonts w:ascii="Times New Roman" w:hAnsi="Times New Roman"/>
-          <w:noProof/>
-          <w:sz w:val="26"/>
-          <w:szCs w:val="26"/>
-        </w:rPr>
-        <w:t>hiện tượng bong bóng lọc,</w:t>
-      </w:r>
-      <w:r>
-        <w:rPr>
-          <w:rFonts w:ascii="Times New Roman" w:hAnsi="Times New Roman"/>
-          <w:noProof/>
-          <w:sz w:val="26"/>
-          <w:szCs w:val="26"/>
-        </w:rPr>
-        <w:t xml:space="preserve"> và hiệu chỉnh biên độ nhiễu cùng tỷ lệ thăm dò bằng thực nghiệm, qua đó nâng dần mức độ cá nhân hóa theo thời gian;</w:t>
+        <w:t>Xây dựng dịch vụ phía máy chủ và ứng dụng di động: hiện thực các nhóm giao diện lập trình phục vụ nghiệp vụ đã thiết kế, và xây dựng các màn hình khai báo hồ sơ, thực đơn hằng ngày, chi tiết món ăn, nhật ký ăn uống và thống kê tiến trình;</w:t>
       </w:r>
     </w:p>
     <w:p>
@@ -1967,7 +1985,7 @@
           <w:sz w:val="26"/>
           <w:szCs w:val="26"/>
         </w:rPr>
-        <w:t>Xây dựng dịch vụ phía máy chủ và ứng dụng di động: hiện thực các nhóm giao diện lập trình phục vụ nghiệp vụ đã thiết kế, và xây dựng các màn hình khai báo hồ sơ, thực đơn hằng ngày, chi tiết món ăn, nhật ký ăn uống và thống kê tiến trình;</w:t>
+        <w:t>Thực nghiệm và đánh giá: đánh giá mô hình khuyến nghị trên tập dữ liệu kiểm thử theo các độ đo Precision@K, Recall@K và NDCG; so sánh với phương án khuyến nghị chỉ dựa trên quy tắc dinh dưỡng để làm rõ đóng góp của thành phần học máy; kiểm thử chức năng, hiệu năng và khảo sát mức độ hài lòng của người dùng thử nghiệm;</w:t>
       </w:r>
     </w:p>
     <w:p>
@@ -1996,40 +2014,11 @@
           <w:sz w:val="26"/>
           <w:szCs w:val="26"/>
         </w:rPr>
-        <w:t>Thực nghiệm và đánh giá: đánh giá mô hình khuyến nghị trên tập dữ liệu kiểm thử theo các độ đo Precision@K, Recall@K và NDCG; so sánh với phương án khuyến nghị chỉ dựa trên quy tắc dinh dưỡng để làm rõ đóng góp của thành phần học máy; kiểm thử chức năng, hiệu năng và khảo sát mức độ hài lòng của người dùng thử nghiệm;</w:t>
+        <w:t>Phân tích kết quả thực nghiệm, chỉ ra ưu điểm và hạn chế của mô hình đã xây dựng.</w:t>
       </w:r>
     </w:p>
     <w:p>
       <w:pPr>
-        <w:pStyle w:val="ListParagraph"/>
-        <w:numPr>
-          <w:ilvl w:val="0"/>
-          <w:numId w:val="10"/>
-        </w:numPr>
-        <w:tabs>
-          <w:tab w:val="left" w:leader="dot" w:pos="8931"/>
-        </w:tabs>
-        <w:spacing w:before="240" w:after="0" w:line="312" w:lineRule="auto"/>
-        <w:jc w:val="both"/>
-        <w:rPr>
-          <w:rFonts w:ascii="Times New Roman" w:hAnsi="Times New Roman"/>
-          <w:noProof/>
-          <w:sz w:val="26"/>
-          <w:szCs w:val="26"/>
-        </w:rPr>
-      </w:pPr>
-      <w:r>
-        <w:rPr>
-          <w:rFonts w:ascii="Times New Roman" w:hAnsi="Times New Roman"/>
-          <w:noProof/>
-          <w:sz w:val="26"/>
-          <w:szCs w:val="26"/>
-        </w:rPr>
-        <w:t>Phân tích kết quả thực nghiệm, chỉ ra ưu điểm và hạn chế của mô hình đã xây dựng.</w:t>
-      </w:r>
-    </w:p>
-    <w:p>
-      <w:pPr>
         <w:tabs>
           <w:tab w:val="left" w:leader="dot" w:pos="8931"/>
         </w:tabs>
@@ -2078,17 +2067,7 @@
           <w:sz w:val="26"/>
           <w:szCs w:val="26"/>
         </w:rPr>
-        <w:t xml:space="preserve"> thông qua phiên tương tác thăm dò được bố trí ngay tại bước khởi tạo tài khoản. Đồ án cũng chỉ ra những hạn chế còn tồn tại như quy mô tập dữ liệu món ăn còn giới hạn, dữ liệu phản hồi được thu thập trong thời gian ngắn và trên một nhóm người dùng thử nghiệm nhỏ nên mức độ cá nhân hóa của mô hình học máy chưa đạt mức tối đa, và chất lượng hồ sơ sở thích ban đầu còn phụ thuộc vào mức độ nghiêm túc của người dùng khi thực hiện phiên tương tác thăm dò. Từ những hạn chế đó, đồ án đề xuất các hướng phát triển tiếp theo: về dữ liệu, mở rộng cơ sở dữ liệu món ăn theo vùng miền và bổ sung các món ăn ngoài hàng quán nhằm tăng tính đa dạng của thực đơn; về mô hình, phân cụm hồ sơ sở thích nhằm xác định các nhóm khẩu vị đặc trưng để rút ngắn hơn nữa giai đoạn khởi đầu nguội, bổ sung thành phần lọc cộng tác khi số lượng người dùng đủ lớn để chuyển sang mô hình lai ghép, và nghiên cứu áp dụng học tăng cường nhằm tối ưu khuyến nghị theo phản hồi </w:t>
-      </w:r>
-      <w:r>
-        <w:rPr>
-          <w:rFonts w:ascii="Times New Roman" w:hAnsi="Times New Roman"/>
-          <w:noProof/>
-          <w:sz w:val="26"/>
-          <w:szCs w:val="26"/>
-        </w:rPr>
-        <w:lastRenderedPageBreak/>
-        <w:t>dài hạn của người dùng; về chức năng, tích hợp nhận diện món ăn từ hình ảnh để rút ngắn thao tác ghi nhật ký, kết nối thiết bị đeo thông minh nhằm thay hệ số vận động ước lượng bằng dữ liệu vận động thực tế, và sinh danh sách nguyên liệu đi chợ theo thực đơn tuần; về phạm vi áp dụng, bổ sung bộ ràng buộc dinh dưỡng chuyên biệt cho các nhóm người dùng có bệnh lý.</w:t>
+        <w:t xml:space="preserve"> thông qua phiên tương tác thăm dò được bố trí ngay tại bước khởi tạo tài khoản. Đồ án cũng chỉ ra những hạn chế còn tồn tại như quy mô tập dữ liệu món ăn còn giới hạn, dữ liệu phản hồi được thu thập trong thời gian ngắn và trên một nhóm người dùng thử nghiệm nhỏ nên mức độ cá nhân hóa của mô hình học máy chưa đạt mức tối đa, và chất lượng hồ sơ sở thích ban đầu còn phụ thuộc vào mức độ nghiêm túc của người dùng khi thực hiện phiên tương tác thăm dò. Từ những hạn chế đó, đồ án đề xuất các hướng phát triển tiếp theo: về dữ liệu, mở rộng cơ sở dữ liệu món ăn theo vùng miền và bổ sung các món ăn ngoài hàng quán nhằm tăng tính đa dạng của thực đơn; về mô hình, phân cụm hồ sơ sở thích nhằm xác định các nhóm khẩu vị đặc trưng để rút ngắn hơn nữa giai đoạn khởi đầu nguội, bổ sung thành phần lọc cộng tác khi số lượng người dùng đủ lớn để chuyển sang mô hình lai ghép, và nghiên cứu áp dụng học tăng cường nhằm tối ưu khuyến nghị theo phản hồi dài hạn của người dùng; về chức năng, tích hợp nhận diện món ăn từ hình ảnh để rút ngắn thao tác ghi nhật ký, kết nối thiết bị đeo thông minh nhằm thay hệ số vận động ước lượng bằng dữ liệu vận động thực tế, và sinh danh sách nguyên liệu đi chợ theo thực đơn tuần; về phạm vi áp dụng, bổ sung bộ ràng buộc dinh dưỡng chuyên biệt cho các nhóm người dùng có bệnh lý.</w:t>
       </w:r>
     </w:p>
     <w:p>

</xml_diff>